<commit_message>
Emphasize epidemiology focus in CV headline and summary
Co-Authored-By: Claude Sonnet 5.5 <noreply@anthropic.com>
Claude-Session: https://claude.ai/code/session_01V4e4XpmJgaTQHFXVp9Zr3J
</commit_message>
<xml_diff>
--- a/IFEOLUWANIMI_SHOBAYO_CV_Carter_Center.docx
+++ b/IFEOLUWANIMI_SHOBAYO_CV_Carter_Center.docx
@@ -14,6 +14,19 @@
           <w:szCs w:val="32"/>
         </w:rPr>
         <w:t>Ifeoluwanimi Praise Shobayo</w:t>
+      </w:r>
+    </w:p>
+    <w:p>
+      <w:pPr>
+        <w:spacing w:after="20"/>
+        <w:jc w:val="center"/>
+      </w:pPr>
+      <w:r>
+        <w:rPr>
+          <w:i/>
+          <w:iCs/>
+        </w:rPr>
+        <w:t>MSPH Candidate in Epidemiology | Infectious Disease Surveillance, Biostatistics &amp; Global Health Research</w:t>
       </w:r>
     </w:p>
     <w:p>
@@ -75,7 +88,7 @@
         <w:spacing w:after="10"/>
       </w:pPr>
       <w:r>
-        <w:t>MSPH candidate in Epidemiology (4.0 GPA) with a global health focus on infectious disease prevention, health equity, and population health, grounded in research and field experience in Nigeria and the United States</w:t>
+        <w:t>Epidemiology graduate student (MSPH, 4.0 GPA) trained in study design, biostatistics, disease surveillance, and spatial analysis, with a global health focus on infectious disease prevention and health equity, grounded in research and field experience in Nigeria and the United States</w:t>
       </w:r>
     </w:p>
     <w:p>

</xml_diff>

<commit_message>
Tighten CV summary to five concise bullets
Co-Authored-By: Claude Sonnet 5.5 <noreply@anthropic.com>
Claude-Session: https://claude.ai/code/session_01V4e4XpmJgaTQHFXVp9Zr3J
</commit_message>
<xml_diff>
--- a/IFEOLUWANIMI_SHOBAYO_CV_Carter_Center.docx
+++ b/IFEOLUWANIMI_SHOBAYO_CV_Carter_Center.docx
@@ -88,77 +88,63 @@
         <w:spacing w:after="10"/>
       </w:pPr>
       <w:r>
-        <w:t>Epidemiology graduate student (MSPH, 4.0 GPA) trained in study design, biostatistics, disease surveillance, and spatial analysis, with a global health focus on infectious disease prevention and health equity, grounded in research and field experience in Nigeria and the United States</w:t>
-      </w:r>
-    </w:p>
-    <w:p>
-      <w:pPr>
-        <w:pStyle w:val="ListParagraph"/>
-        <w:keepLines/>
-        <w:numPr>
-          <w:ilvl w:val="0"/>
-          <w:numId w:val="2"/>
-        </w:numPr>
-        <w:spacing w:after="10"/>
-      </w:pPr>
-      <w:r>
-        <w:t>Hands-on field and laboratory experience in infectious disease research: malaria diagnostics, COVID-19 sample processing under biosafety protocols, and mobile survey data collection (Kobo Collect) for an occupational health study of 100 participants in Ibadan, Nigeria</w:t>
-      </w:r>
-    </w:p>
-    <w:p>
-      <w:pPr>
-        <w:pStyle w:val="ListParagraph"/>
-        <w:keepLines/>
-        <w:numPr>
-          <w:ilvl w:val="0"/>
-          <w:numId w:val="2"/>
-        </w:numPr>
-        <w:spacing w:after="10"/>
-      </w:pPr>
-      <w:r>
-        <w:t>Skilled in statistical analysis, data visualization, and spatial mapping using SAS, R, Python, Tableau, and ArcGIS, including linear mixed-effects modeling</w:t>
-      </w:r>
-    </w:p>
-    <w:p>
-      <w:pPr>
-        <w:pStyle w:val="ListParagraph"/>
-        <w:keepLines/>
-        <w:numPr>
-          <w:ilvl w:val="0"/>
-          <w:numId w:val="2"/>
-        </w:numPr>
-        <w:spacing w:after="10"/>
-      </w:pPr>
-      <w:r>
-        <w:t>Strong communicator and educator: teach and tutor undergraduate public health and biostatistics, develop workshops, and present research as first author on six posters (two accepted at APHA 2026) and co-author on four peer-reviewed publications</w:t>
-      </w:r>
-    </w:p>
-    <w:p>
-      <w:pPr>
-        <w:pStyle w:val="ListParagraph"/>
-        <w:keepLines/>
-        <w:numPr>
-          <w:ilvl w:val="0"/>
-          <w:numId w:val="2"/>
-        </w:numPr>
-        <w:spacing w:after="10"/>
-      </w:pPr>
-      <w:r>
-        <w:t>Completed an infection prevention and hospital epidemiology observership at Emory Johns Creek Hospital (Georgia), with exposure to NHSN surveillance and healthcare-associated infection prevention</w:t>
-      </w:r>
-    </w:p>
-    <w:p>
-      <w:pPr>
-        <w:pStyle w:val="ListParagraph"/>
-        <w:keepLines/>
-        <w:numPr>
-          <w:ilvl w:val="0"/>
-          <w:numId w:val="2"/>
-        </w:numPr>
-        <w:spacing w:after="10"/>
-      </w:pPr>
-      <w:r>
-        <w:t>Experienced in research protocol development and grant application support (Liberty University Office of Sponsored Programs &amp; Research); works effectively with culturally diverse groups in Nigeria and the United States through community outreach and teaching</w:t>
+        <w:t>Epidemiology graduate student (MSPH, 4.0 GPA) trained in study design, biostatistics, and disease surveillance, focused on infectious disease prevention and global health</w:t>
+      </w:r>
+    </w:p>
+    <w:p>
+      <w:pPr>
+        <w:pStyle w:val="ListParagraph"/>
+        <w:keepLines/>
+        <w:numPr>
+          <w:ilvl w:val="0"/>
+          <w:numId w:val="2"/>
+        </w:numPr>
+        <w:spacing w:after="10"/>
+      </w:pPr>
+      <w:r>
+        <w:t>Field and laboratory experience in Nigeria, including malaria diagnostics, COVID-19 sample processing, and Kobo Collect survey data collection for an occupational health study of 100 police officers</w:t>
+      </w:r>
+    </w:p>
+    <w:p>
+      <w:pPr>
+        <w:pStyle w:val="ListParagraph"/>
+        <w:keepLines/>
+        <w:numPr>
+          <w:ilvl w:val="0"/>
+          <w:numId w:val="2"/>
+        </w:numPr>
+        <w:spacing w:after="10"/>
+      </w:pPr>
+      <w:r>
+        <w:t>Data analysis and visualization using SAS, R, Python, Tableau, and ArcGIS, including linear mixed-effects models</w:t>
+      </w:r>
+    </w:p>
+    <w:p>
+      <w:pPr>
+        <w:pStyle w:val="ListParagraph"/>
+        <w:keepLines/>
+        <w:numPr>
+          <w:ilvl w:val="0"/>
+          <w:numId w:val="2"/>
+        </w:numPr>
+        <w:spacing w:after="10"/>
+      </w:pPr>
+      <w:r>
+        <w:t>First author on six research posters (two accepted at APHA 2026) and co-author on four peer-reviewed publications; teach and tutor undergraduate public health and biostatistics</w:t>
+      </w:r>
+    </w:p>
+    <w:p>
+      <w:pPr>
+        <w:pStyle w:val="ListParagraph"/>
+        <w:keepLines/>
+        <w:numPr>
+          <w:ilvl w:val="0"/>
+          <w:numId w:val="2"/>
+        </w:numPr>
+        <w:spacing w:after="10"/>
+      </w:pPr>
+      <w:r>
+        <w:t>Completed an infection prevention and hospital epidemiology observership at Emory Johns Creek Hospital, with exposure to NHSN surveillance and healthcare-associated infection prevention</w:t>
       </w:r>
     </w:p>
     <w:p>

</xml_diff>

<commit_message>
Restructure CV summary to follow Liberty career services sample format
Co-Authored-By: Claude Sonnet 5.5 <noreply@anthropic.com>
Claude-Session: https://claude.ai/code/session_01V4e4XpmJgaTQHFXVp9Zr3J
</commit_message>
<xml_diff>
--- a/IFEOLUWANIMI_SHOBAYO_CV_Carter_Center.docx
+++ b/IFEOLUWANIMI_SHOBAYO_CV_Carter_Center.docx
@@ -88,63 +88,77 @@
         <w:spacing w:after="10"/>
       </w:pPr>
       <w:r>
-        <w:t>Epidemiology graduate student (MSPH, 4.0 GPA) trained in study design, biostatistics, and disease surveillance, focused on infectious disease prevention and global health</w:t>
-      </w:r>
-    </w:p>
-    <w:p>
-      <w:pPr>
-        <w:pStyle w:val="ListParagraph"/>
-        <w:keepLines/>
-        <w:numPr>
-          <w:ilvl w:val="0"/>
-          <w:numId w:val="2"/>
-        </w:numPr>
-        <w:spacing w:after="10"/>
-      </w:pPr>
-      <w:r>
-        <w:t>Field and laboratory experience in Nigeria, including malaria diagnostics, COVID-19 sample processing, and Kobo Collect survey data collection for an occupational health study of 100 police officers</w:t>
-      </w:r>
-    </w:p>
-    <w:p>
-      <w:pPr>
-        <w:pStyle w:val="ListParagraph"/>
-        <w:keepLines/>
-        <w:numPr>
-          <w:ilvl w:val="0"/>
-          <w:numId w:val="2"/>
-        </w:numPr>
-        <w:spacing w:after="10"/>
-      </w:pPr>
-      <w:r>
-        <w:t>Data analysis and visualization using SAS, R, Python, Tableau, and ArcGIS, including linear mixed-effects models</w:t>
-      </w:r>
-    </w:p>
-    <w:p>
-      <w:pPr>
-        <w:pStyle w:val="ListParagraph"/>
-        <w:keepLines/>
-        <w:numPr>
-          <w:ilvl w:val="0"/>
-          <w:numId w:val="2"/>
-        </w:numPr>
-        <w:spacing w:after="10"/>
-      </w:pPr>
-      <w:r>
-        <w:t>First author on six research posters (two accepted at APHA 2026) and co-author on four peer-reviewed publications; teach and tutor undergraduate public health and biostatistics</w:t>
-      </w:r>
-    </w:p>
-    <w:p>
-      <w:pPr>
-        <w:pStyle w:val="ListParagraph"/>
-        <w:keepLines/>
-        <w:numPr>
-          <w:ilvl w:val="0"/>
-          <w:numId w:val="2"/>
-        </w:numPr>
-        <w:spacing w:after="10"/>
-      </w:pPr>
-      <w:r>
-        <w:t>Completed an infection prevention and hospital epidemiology observership at Emory Johns Creek Hospital, with exposure to NHSN surveillance and healthcare-associated infection prevention</w:t>
+        <w:t>Educated and trained in the foundational principles of epidemiology, biostatistics, and disease surveillance, with a focus on infectious disease prevention and global health</w:t>
+      </w:r>
+    </w:p>
+    <w:p>
+      <w:pPr>
+        <w:pStyle w:val="ListParagraph"/>
+        <w:keepLines/>
+        <w:numPr>
+          <w:ilvl w:val="0"/>
+          <w:numId w:val="2"/>
+        </w:numPr>
+        <w:spacing w:after="10"/>
+      </w:pPr>
+      <w:r>
+        <w:t>Skilled in statistical analysis and data visualization using SAS, R, Python, Tableau, and ArcGIS, including linear mixed-effects models</w:t>
+      </w:r>
+    </w:p>
+    <w:p>
+      <w:pPr>
+        <w:pStyle w:val="ListParagraph"/>
+        <w:keepLines/>
+        <w:numPr>
+          <w:ilvl w:val="0"/>
+          <w:numId w:val="2"/>
+        </w:numPr>
+        <w:spacing w:after="10"/>
+      </w:pPr>
+      <w:r>
+        <w:t>Experienced in field and laboratory research in Nigeria, including malaria diagnostics, COVID-19 sample processing, and Kobo Collect survey data collection for an occupational health study of 100 police officers</w:t>
+      </w:r>
+    </w:p>
+    <w:p>
+      <w:pPr>
+        <w:pStyle w:val="ListParagraph"/>
+        <w:keepLines/>
+        <w:numPr>
+          <w:ilvl w:val="0"/>
+          <w:numId w:val="2"/>
+        </w:numPr>
+        <w:spacing w:after="10"/>
+      </w:pPr>
+      <w:r>
+        <w:t>Proficient in research methodology and protocol development, with six first-author research posters (two accepted at APHA 2026) and four co-authored peer-reviewed publications</w:t>
+      </w:r>
+    </w:p>
+    <w:p>
+      <w:pPr>
+        <w:pStyle w:val="ListParagraph"/>
+        <w:keepLines/>
+        <w:numPr>
+          <w:ilvl w:val="0"/>
+          <w:numId w:val="2"/>
+        </w:numPr>
+        <w:spacing w:after="10"/>
+      </w:pPr>
+      <w:r>
+        <w:t>Demonstrated teaching and communication skills as a graduate student assistant and biostatistics tutor, developing workshops and instructional materials for undergraduate and graduate students</w:t>
+      </w:r>
+    </w:p>
+    <w:p>
+      <w:pPr>
+        <w:pStyle w:val="ListParagraph"/>
+        <w:keepLines/>
+        <w:numPr>
+          <w:ilvl w:val="0"/>
+          <w:numId w:val="2"/>
+        </w:numPr>
+        <w:spacing w:after="10"/>
+      </w:pPr>
+      <w:r>
+        <w:t>Interfaced with culturally diverse groups in Nigeria and the United States through community outreach and teaching; completed an infection prevention and hospital epidemiology observership at Emory Johns Creek Hospital</w:t>
       </w:r>
     </w:p>
     <w:p>

</xml_diff>

<commit_message>
Rewrite CV summary as a short flowing paragraph
Co-Authored-By: Claude Sonnet 5.5 <noreply@anthropic.com>
Claude-Session: https://claude.ai/code/session_01V4e4XpmJgaTQHFXVp9Zr3J
</commit_message>
<xml_diff>
--- a/IFEOLUWANIMI_SHOBAYO_CV_Carter_Center.docx
+++ b/IFEOLUWANIMI_SHOBAYO_CV_Carter_Center.docx
@@ -79,86 +79,11 @@
     </w:p>
     <w:p>
       <w:pPr>
-        <w:pStyle w:val="ListParagraph"/>
-        <w:keepLines/>
-        <w:numPr>
-          <w:ilvl w:val="0"/>
-          <w:numId w:val="2"/>
-        </w:numPr>
-        <w:spacing w:after="10"/>
-      </w:pPr>
-      <w:r>
-        <w:t>Educated and trained in the foundational principles of epidemiology, biostatistics, and disease surveillance, with a focus on infectious disease prevention and global health</w:t>
-      </w:r>
-    </w:p>
-    <w:p>
-      <w:pPr>
-        <w:pStyle w:val="ListParagraph"/>
-        <w:keepLines/>
-        <w:numPr>
-          <w:ilvl w:val="0"/>
-          <w:numId w:val="2"/>
-        </w:numPr>
-        <w:spacing w:after="10"/>
-      </w:pPr>
-      <w:r>
-        <w:t>Skilled in statistical analysis and data visualization using SAS, R, Python, Tableau, and ArcGIS, including linear mixed-effects models</w:t>
-      </w:r>
-    </w:p>
-    <w:p>
-      <w:pPr>
-        <w:pStyle w:val="ListParagraph"/>
-        <w:keepLines/>
-        <w:numPr>
-          <w:ilvl w:val="0"/>
-          <w:numId w:val="2"/>
-        </w:numPr>
-        <w:spacing w:after="10"/>
-      </w:pPr>
-      <w:r>
-        <w:t>Experienced in field and laboratory research in Nigeria, including malaria diagnostics, COVID-19 sample processing, and Kobo Collect survey data collection for an occupational health study of 100 police officers</w:t>
-      </w:r>
-    </w:p>
-    <w:p>
-      <w:pPr>
-        <w:pStyle w:val="ListParagraph"/>
-        <w:keepLines/>
-        <w:numPr>
-          <w:ilvl w:val="0"/>
-          <w:numId w:val="2"/>
-        </w:numPr>
-        <w:spacing w:after="10"/>
-      </w:pPr>
-      <w:r>
-        <w:t>Proficient in research methodology and protocol development, with six first-author research posters (two accepted at APHA 2026) and four co-authored peer-reviewed publications</w:t>
-      </w:r>
-    </w:p>
-    <w:p>
-      <w:pPr>
-        <w:pStyle w:val="ListParagraph"/>
-        <w:keepLines/>
-        <w:numPr>
-          <w:ilvl w:val="0"/>
-          <w:numId w:val="2"/>
-        </w:numPr>
-        <w:spacing w:after="10"/>
-      </w:pPr>
-      <w:r>
-        <w:t>Demonstrated teaching and communication skills as a graduate student assistant and biostatistics tutor, developing workshops and instructional materials for undergraduate and graduate students</w:t>
-      </w:r>
-    </w:p>
-    <w:p>
-      <w:pPr>
-        <w:pStyle w:val="ListParagraph"/>
-        <w:keepLines/>
-        <w:numPr>
-          <w:ilvl w:val="0"/>
-          <w:numId w:val="2"/>
-        </w:numPr>
-        <w:spacing w:after="10"/>
-      </w:pPr>
-      <w:r>
-        <w:t>Interfaced with culturally diverse groups in Nigeria and the United States through community outreach and teaching; completed an infection prevention and hospital epidemiology observership at Emory Johns Creek Hospital</w:t>
+        <w:keepLines/>
+        <w:spacing w:after="40"/>
+      </w:pPr>
+      <w:r>
+        <w:t>Epidemiology graduate student (MSPH, 4.0 GPA) focused on infectious disease prevention and global health. Experience spans malaria and COVID-19 laboratory work and field survey research in Nigeria, an infection prevention and hospital epidemiology observership at Emory Johns Creek Hospital, and data analysis and visualization in SAS, R, Python, Tableau, and ArcGIS. First author on six research posters and co-author on four peer-reviewed publications, with experience teaching and tutoring biostatistics and communicating findings to culturally diverse audiences in Nigeria and the United States.</w:t>
       </w:r>
     </w:p>
     <w:p>

</xml_diff>

<commit_message>
Restore six-bullet summary as provided by user
Co-Authored-By: Claude Sonnet 5.5 <noreply@anthropic.com>
Claude-Session: https://claude.ai/code/session_01V4e4XpmJgaTQHFXVp9Zr3J
</commit_message>
<xml_diff>
--- a/IFEOLUWANIMI_SHOBAYO_CV_Carter_Center.docx
+++ b/IFEOLUWANIMI_SHOBAYO_CV_Carter_Center.docx
@@ -79,11 +79,86 @@
     </w:p>
     <w:p>
       <w:pPr>
-        <w:keepLines/>
-        <w:spacing w:after="40"/>
-      </w:pPr>
-      <w:r>
-        <w:t>Epidemiology graduate student (MSPH, 4.0 GPA) with a passion for preventing infectious disease in underserved communities. Field work in Nigeria, from malaria diagnostics and COVID-19 sample processing to a 100-participant occupational health survey, built a practical understanding of how field data becomes public health action, complemented by hospital infection surveillance exposure at Emory and data analysis in SAS, R, Python, Tableau, and ArcGIS. Shares this work through six first-author posters, four co-authored publications, and teaching and tutoring in biostatistics. Eager to bring this foundation to the Carter Center’s mission to fight disease and build hope.</w:t>
+        <w:pStyle w:val="ListParagraph"/>
+        <w:keepLines/>
+        <w:numPr>
+          <w:ilvl w:val="0"/>
+          <w:numId w:val="2"/>
+        </w:numPr>
+        <w:spacing w:after="10"/>
+      </w:pPr>
+      <w:r>
+        <w:t>MSPH candidate in Epidemiology (4.0 GPA) with a global health focus on infectious disease prevention, health equity, and population health, grounded in research and field experience in Nigeria and the United States</w:t>
+      </w:r>
+    </w:p>
+    <w:p>
+      <w:pPr>
+        <w:pStyle w:val="ListParagraph"/>
+        <w:keepLines/>
+        <w:numPr>
+          <w:ilvl w:val="0"/>
+          <w:numId w:val="2"/>
+        </w:numPr>
+        <w:spacing w:after="10"/>
+      </w:pPr>
+      <w:r>
+        <w:t>Hands-on field and laboratory experience in infectious disease research: malaria diagnostics, COVID-19 sample processing under biosafety protocols, and mobile survey data collection (Kobo Collect) for an occupational health study of 100 participants in Ibadan, Nigeria</w:t>
+      </w:r>
+    </w:p>
+    <w:p>
+      <w:pPr>
+        <w:pStyle w:val="ListParagraph"/>
+        <w:keepLines/>
+        <w:numPr>
+          <w:ilvl w:val="0"/>
+          <w:numId w:val="2"/>
+        </w:numPr>
+        <w:spacing w:after="10"/>
+      </w:pPr>
+      <w:r>
+        <w:t>Skilled in statistical analysis, data visualization, and spatial mapping using SAS, R, Python, Tableau, and ArcGIS, including linear mixed-effects modeling</w:t>
+      </w:r>
+    </w:p>
+    <w:p>
+      <w:pPr>
+        <w:pStyle w:val="ListParagraph"/>
+        <w:keepLines/>
+        <w:numPr>
+          <w:ilvl w:val="0"/>
+          <w:numId w:val="2"/>
+        </w:numPr>
+        <w:spacing w:after="10"/>
+      </w:pPr>
+      <w:r>
+        <w:t>Strong communicator and educator: teach and tutor undergraduate public health and biostatistics, develop workshops, and present research as first author on six posters (two accepted at APHA 2026) and co-author on four peer-reviewed publications</w:t>
+      </w:r>
+    </w:p>
+    <w:p>
+      <w:pPr>
+        <w:pStyle w:val="ListParagraph"/>
+        <w:keepLines/>
+        <w:numPr>
+          <w:ilvl w:val="0"/>
+          <w:numId w:val="2"/>
+        </w:numPr>
+        <w:spacing w:after="10"/>
+      </w:pPr>
+      <w:r>
+        <w:t>Completed an infection prevention and hospital epidemiology observership at Emory Johns Creek Hospital (Georgia), with exposure to NHSN surveillance and healthcare-associated infection prevention</w:t>
+      </w:r>
+    </w:p>
+    <w:p>
+      <w:pPr>
+        <w:pStyle w:val="ListParagraph"/>
+        <w:keepLines/>
+        <w:numPr>
+          <w:ilvl w:val="0"/>
+          <w:numId w:val="2"/>
+        </w:numPr>
+        <w:spacing w:after="10"/>
+      </w:pPr>
+      <w:r>
+        <w:t>Experienced in research protocol development and grant application support (Liberty University Office of Sponsored Programs &amp; Research); works effectively with culturally diverse groups in Nigeria and the United States through community outreach and teaching</w:t>
       </w:r>
     </w:p>
     <w:p>

</xml_diff>